<commit_message>
Update Supplementary Material to corrected author byline
The previously committed Supplementary was missing Zhumagulova from
the author line (same issue already fixed for CITATION.cff and the
main manuscript). The rest of the document is unchanged -- verified by
diffing extracted text against the prior version, only the byline
differs.
</commit_message>
<xml_diff>
--- a/manuscript/Training_Randomness_Supplementary_final_ML.docx
+++ b/manuscript/Training_Randomness_Supplementary_final_ML.docx
@@ -41,7 +41,53 @@
         <w:rPr>
           <w:lang w:val="en-US"/>
         </w:rPr>
-        <w:t>Liliya Tanchenko, Akylbek Tokhmetov*, Danel Musina</w:t>
+        <w:t xml:space="preserve">Akylbek Tokhmetov </w:t>
+      </w:r>
+      <w:r>
+        <w:rPr>
+          <w:vertAlign w:val="superscript"/>
+          <w:lang w:val="en-US"/>
+        </w:rPr>
+        <w:t>1</w:t>
+      </w:r>
+      <w:r>
+        <w:rPr>
+          <w:lang w:val="en-US"/>
+        </w:rPr>
+        <w:t xml:space="preserve">*, Saule Zhumagulovа </w:t>
+      </w:r>
+      <w:r>
+        <w:rPr>
+          <w:vertAlign w:val="superscript"/>
+          <w:lang w:val="en-US"/>
+        </w:rPr>
+        <w:t>2</w:t>
+      </w:r>
+      <w:r>
+        <w:rPr>
+          <w:lang w:val="en-US"/>
+        </w:rPr>
+        <w:t xml:space="preserve">*, Liliya Tanchenko </w:t>
+      </w:r>
+      <w:r>
+        <w:rPr>
+          <w:vertAlign w:val="superscript"/>
+          <w:lang w:val="en-US"/>
+        </w:rPr>
+        <w:t>1</w:t>
+      </w:r>
+      <w:r>
+        <w:rPr>
+          <w:lang w:val="en-US"/>
+        </w:rPr>
+        <w:t xml:space="preserve">, Danel Musina </w:t>
+      </w:r>
+      <w:r>
+        <w:rPr>
+          <w:vertAlign w:val="superscript"/>
+          <w:lang w:val="en-US"/>
+        </w:rPr>
+        <w:t>1</w:t>
       </w:r>
     </w:p>
     <w:p>
@@ -53,9 +99,63 @@
       </w:pPr>
       <w:r>
         <w:rPr>
+          <w:vertAlign w:val="superscript"/>
+          <w:lang w:val="en-US"/>
+        </w:rPr>
+        <w:t>1</w:t>
+      </w:r>
+      <w:r>
+        <w:rPr>
+          <w:lang w:val="en-US"/>
+        </w:rPr>
+        <w:t xml:space="preserve"> </w:t>
+      </w:r>
+      <w:r>
+        <w:rPr>
           <w:lang w:val="en-US"/>
         </w:rPr>
         <w:t>Department of Information Systems, L.N. Gumilyov Eurasian National University, Astana, Kazakhstan</w:t>
+      </w:r>
+    </w:p>
+    <w:p>
+      <w:pPr>
+        <w:jc w:val="both"/>
+        <w:rPr>
+          <w:lang w:val="en-US"/>
+        </w:rPr>
+      </w:pPr>
+      <w:r>
+        <w:rPr>
+          <w:vertAlign w:val="superscript"/>
+          <w:lang w:val="en-US"/>
+        </w:rPr>
+        <w:t>2</w:t>
+      </w:r>
+      <w:r>
+        <w:rPr>
+          <w:lang w:val="en-US"/>
+        </w:rPr>
+        <w:t xml:space="preserve"> </w:t>
+      </w:r>
+      <w:r>
+        <w:rPr>
+          <w:lang w:val="en-US"/>
+        </w:rPr>
+        <w:t xml:space="preserve">Department of applied mathematics and computer science, Karaganda National Research University named after Academician E.A. </w:t>
+      </w:r>
+      <w:proofErr w:type="spellStart"/>
+      <w:r>
+        <w:rPr>
+          <w:lang w:val="en-US"/>
+        </w:rPr>
+        <w:t>Buketov</w:t>
+      </w:r>
+      <w:proofErr w:type="spellEnd"/>
+      <w:r>
+        <w:rPr>
+          <w:lang w:val="en-US"/>
+        </w:rPr>
+        <w:t>, Karaganda, Kazakhstan</w:t>
       </w:r>
     </w:p>
     <w:p>
@@ -1355,7 +1455,14 @@
         <w:rPr>
           <w:lang w:val="en-US"/>
         </w:rPr>
-        <w:t>We audit the resulting windows rather than assume their quality, and report the audit because it bears on the interpretation of three households. No missing values survive preprocessing in any dataset. The fraction of training data that is locally linear, and therefore either interpolated or constant, varies considerably: it reaches 29.2% on one REFIT household, mostly interpolated, and stays below 1.5% on most SHEERM households. Runs of constant meter readings up to 168 hours long occur in the training segments of four households and, in one REFIT household, in the test segment as well, where 14.8% of test targets are constant across the full forecast horizon and are therefore trivially predictable. That household behaves as an outlier throughout the results, and we flag it wherever it matters rather than removing it.</w:t>
+        <w:t xml:space="preserve">We audit the resulting windows rather than assume their quality, and report the audit because it bears on the interpretation of three households. No missing values survive preprocessing in any dataset. The fraction of training data that is locally linear, and therefore either interpolated or constant, varies considerably: it reaches 29.2% on one REFIT household, mostly interpolated, and stays below 1.5% on most SHEERM households. Runs of constant meter readings up to 168 hours long occur in the training segments of four households and, in one REFIT household, in the test segment as well, where 14.8% of test targets are </w:t>
+      </w:r>
+      <w:r>
+        <w:rPr>
+          <w:lang w:val="en-US"/>
+        </w:rPr>
+        <w:lastRenderedPageBreak/>
+        <w:t>constant across the full forecast horizon and are therefore trivially predictable. That household behaves as an outlier throughout the results, and we flag it wherever it matters rather than removing it.</w:t>
       </w:r>
     </w:p>
     <w:p>
@@ -1371,7 +1478,6 @@
           <w:rFonts w:ascii="Times New Roman" w:eastAsia="Times New Roman" w:hAnsi="Times New Roman"/>
           <w:lang w:val="en-US"/>
         </w:rPr>
-        <w:lastRenderedPageBreak/>
         <w:t>S1.2. Factorial design</w:t>
       </w:r>
     </w:p>
@@ -1563,6 +1669,7 @@
         <w:rPr>
           <w:lang w:val="en-US"/>
         </w:rPr>
+        <w:lastRenderedPageBreak/>
         <w:t>The model-based interval also settles the interpretation of the two households whose point estimate is zero. Their intervals are [0, 75] and [0, 81]%: a point estimate of zero reflects a component that cannot be separated from zero at five seeds, not an absence of seed variance. Both households have large and well-determined shares on the branch output, 96 and 83%.</w:t>
       </w:r>
     </w:p>
@@ -1579,7 +1686,6 @@
           <w:rFonts w:ascii="Times New Roman" w:eastAsia="Times New Roman" w:hAnsi="Times New Roman"/>
           <w:lang w:val="en-US"/>
         </w:rPr>
-        <w:lastRenderedPageBreak/>
         <w:t>S2.2. Training-seed contribution at the regime level</w:t>
       </w:r>
     </w:p>
@@ -2367,9 +2473,14 @@
         <w:rPr>
           <w:lang w:val="en-US"/>
         </w:rPr>
-        <w:t xml:space="preserve">The consequence for sample size is real but smaller than it first appears, and the calculation needs an outlier-resistant estimate to be read at all. It rests on the mean within-household variance, and one household with degenerate test targets supplies 79% of the sum of the seventeen values, exceeding the median by two orders of magnitude. Detecting a mean effect of one% of household error at 80% power requires 8 households under window-only standard errors and 41 under full propagation; on a 10% trimmed mean the same figures are 6 and 11. At the 2% threshold they are 2 and 11 untrimmed, 2 and 3 trimmed. Leave-one-out over all seventeen households leaves the untrimmed requirement at the 2% threshold at 11 in fifteen cases and 10 in one, falling to 3 only when the degenerate household is removed — the same household flagged independently in the data audit of Section 4.2.1. What is robust is the direction and the fact that </w:t>
+        <w:t xml:space="preserve">The consequence for sample size is real but smaller than it first appears, and the calculation needs an outlier-resistant estimate to be read at all. It rests on the mean within-household variance, and one household with degenerate test targets supplies 79% of the sum of the seventeen values, exceeding the median by two orders of magnitude. Detecting a mean effect of one% of household error at 80% power requires 8 households under window-only standard errors and 41 under full propagation; on a 10% trimmed mean the </w:t>
+      </w:r>
+      <w:r>
+        <w:rPr>
+          <w:lang w:val="en-US"/>
+        </w:rPr>
         <w:lastRenderedPageBreak/>
-        <w:t>five households give no useful power at the 1% threshold under any variant; the individual figures are not, and we report the trimmed calculation as primary and the untrimmed one as an upper scenario. The study that originally motivated this work used five.</w:t>
+        <w:t>same figures are 6 and 11. At the 2% threshold they are 2 and 11 untrimmed, 2 and 3 trimmed. Leave-one-out over all seventeen households leaves the untrimmed requirement at the 2% threshold at 11 in fifteen cases and 10 in one, falling to 3 only when the degenerate household is removed — the same household flagged independently in the data audit of Section 4.2.1. What is robust is the direction and the fact that five households give no useful power at the 1% threshold under any variant; the individual figures are not, and we report the trimmed calculation as primary and the untrimmed one as an upper scenario. The study that originally motivated this work used five.</w:t>
       </w:r>
     </w:p>
     <w:p>
@@ -2748,14 +2859,25 @@
                 <w:lang w:val="en-US"/>
               </w:rPr>
             </w:pPr>
-            <w:r>
-              <w:rPr>
-                <w:rFonts w:cs="Times New Roman"/>
-                <w:sz w:val="18"/>
-                <w:szCs w:val="18"/>
-                <w:lang w:val="en-US"/>
-              </w:rPr>
-              <w:t xml:space="preserve">PatchTST (undecomposed)</w:t>
+            <w:proofErr w:type="spellStart"/>
+            <w:r>
+              <w:rPr>
+                <w:rFonts w:cs="Times New Roman"/>
+                <w:sz w:val="18"/>
+                <w:szCs w:val="18"/>
+                <w:lang w:val="en-US"/>
+              </w:rPr>
+              <w:t>PatchTST</w:t>
+            </w:r>
+            <w:proofErr w:type="spellEnd"/>
+            <w:r>
+              <w:rPr>
+                <w:rFonts w:cs="Times New Roman"/>
+                <w:sz w:val="18"/>
+                <w:szCs w:val="18"/>
+                <w:lang w:val="en-US"/>
+              </w:rPr>
+              <w:t xml:space="preserve"> (undecomposed)</w:t>
             </w:r>
           </w:p>
         </w:tc>
@@ -3372,7 +3494,14 @@
         <w:rPr>
           <w:lang w:val="en-US"/>
         </w:rPr>
-        <w:t>The gate makes no difference to the balance of the two components. The seed-to-evaluation variance ratio has a median of 24.1 with the gate and 12.8 without it (Wilcoxon p = 0.52), and the seed share 83 against 72% (p = 0.78). Reporting the components separately shows why: removing the gate raises the seed variance by a median factor of 2.4 and the window variance of the mean by 2.0, leaving their ratio where it was. The gate suppresses seed-driven variation at the output, as Section 5.1.3 reports, but suppresses evaluation variation to the same degree.</w:t>
+        <w:t xml:space="preserve">The gate makes no difference to the balance of the two components. The seed-to-evaluation variance ratio has a median of 24.1 with the gate and 12.8 without it (Wilcoxon p = 0.52), and the seed share 83 against 72% (p = 0.78). Reporting the components separately shows why: removing the gate raises the seed </w:t>
+      </w:r>
+      <w:r>
+        <w:rPr>
+          <w:lang w:val="en-US"/>
+        </w:rPr>
+        <w:lastRenderedPageBreak/>
+        <w:t>variance by a median factor of 2.4 and the window variance of the mean by 2.0, leaving their ratio where it was. The gate suppresses seed-driven variation at the output, as Section 5.1.3 reports, but suppresses evaluation variation to the same degree.</w:t>
       </w:r>
     </w:p>
     <w:p>
@@ -3386,7 +3515,6 @@
         <w:rPr>
           <w:lang w:val="en-US"/>
         </w:rPr>
-        <w:lastRenderedPageBreak/>
         <w:t>Two things follow, and a third does not. First, the estimated ordering reflects the evaluated regime—few expensive training runs against many evaluation points—rather than the fusion gate alone. Second, removing the gate raises both absolute variance components while leaving their ratio statistically unchanged. What does not follow is that the gate is inert or that a majority training contribution holds for every unit; the five-seed intervals remain too wide for that unit-level claim.</w:t>
       </w:r>
     </w:p>
@@ -4621,7 +4749,14 @@
         <w:rPr>
           <w:lang w:val="en-US"/>
         </w:rPr>
-        <w:t>Under the original objective, the decomposition branch is a near-constant signal: its standard deviation is around nine% of the target standard deviation, and on 11 of 17 households, its error exceeds that of the constant predictor. The direct branch errs in the opposite direction, over-dispersed and biased upward on every household without exception, by between 149 and 618 W and worse than the constant predictor on 16 of 17. Neither path is individually a working forecast for most households; their combination is one everywhere.</w:t>
+        <w:t xml:space="preserve">Under the original objective, the decomposition branch is a near-constant signal: its standard deviation is around nine% of the target standard deviation, and on 11 of 17 households, its error exceeds that of the constant predictor. The direct branch errs in the opposite direction, over-dispersed and biased upward on </w:t>
+      </w:r>
+      <w:r>
+        <w:rPr>
+          <w:lang w:val="en-US"/>
+        </w:rPr>
+        <w:lastRenderedPageBreak/>
+        <w:t>every household without exception, by between 149 and 618 W and worse than the constant predictor on 16 of 17. Neither path is individually a working forecast for most households; their combination is one everywhere.</w:t>
       </w:r>
     </w:p>
     <w:p>
@@ -4635,7 +4770,6 @@
         <w:rPr>
           <w:lang w:val="en-US"/>
         </w:rPr>
-        <w:lastRenderedPageBreak/>
         <w:t>The correlations with the target locate the defect. Under the original objective, the decomposition branch correlates with the target at a median of 0.49 across households, the direct branch at 0.52, and the fused forecast at 0.53; the median gain in correlation from either path to the fused output is 0.044 and never exceeds 0.124. Each path tracks the target almost as well as the model does as a whole. The paths therefore carry the shape of the signal and lack only scale and level, and the gate is not selecting between two forecasts but performing an affine recalibration of two mis-scaled ones, which is how a convex combination can outperform both of its inputs.</w:t>
       </w:r>
     </w:p>
@@ -4728,6 +4862,7 @@
           <w:noProof/>
           <w:lang w:val="en-US"/>
         </w:rPr>
+        <w:lastRenderedPageBreak/>
         <w:drawing>
           <wp:inline distT="0" distB="0" distL="0" distR="0" wp14:anchorId="3CD35A51" wp14:editId="133CA7ED">
             <wp:extent cx="4632969" cy="2785878"/>
@@ -4791,9 +4926,7 @@
         <w:rPr>
           <w:lang w:val="en-US"/>
         </w:rPr>
-        <w:t xml:space="preserve"> Amplitude of the decomposition branch under four combinations of auxiliary objective and aggregation rule. Each point is one household; bars are medians. A dashed line marks the correct scale. </w:t>
-        <w:lastRenderedPageBreak/>
-        <w:t>Consistent cells keep amplitude near correct; inconsistent ones fail in opposite directions (sum+convex compresses by ≈ number of modes, reverse pairing overshoots). Vertical axis logarithmic. Eight‑cell design run on six households; two leftmost cells on all 17</w:t>
+        <w:t xml:space="preserve"> Amplitude of the decomposition branch under four combinations of auxiliary objective and aggregation rule. Each point is one household; bars are medians. A dashed line marks the correct scale. Consistent cells keep amplitude near correct; inconsistent ones fail in opposite directions (sum+convex compresses by ≈ number of modes, reverse pairing overshoots). Vertical axis logarithmic. Eight‑cell design run on six households; two leftmost cells on all 17</w:t>
       </w:r>
     </w:p>
     <w:p>
@@ -4855,6 +4988,7 @@
           <w:noProof/>
           <w:lang w:val="en-US"/>
         </w:rPr>
+        <w:lastRenderedPageBreak/>
         <w:drawing>
           <wp:inline distT="0" distB="0" distL="0" distR="0" wp14:anchorId="1902E20D" wp14:editId="1EA6D3FB">
             <wp:extent cx="5940425" cy="3712845"/>
@@ -4950,50 +5084,56 @@
         <w:rPr>
           <w:lang w:val="en-US"/>
         </w:rPr>
+        <w:t>The same conclusion follows from the factorial experiment in the opposite direction (see Fig. S1). Across its eight cells the error of the decomposition branch varies by a factor of 5.3 to 14.4 depending on the household, while the fused forecast varies by between 1.5 and 11%; on the household with the largest test set the contrast is a factor of 6.9 in the path, from 162 to 1118 W, against 1.5% in the fused forecast. Degradation and repair are equally invisible, and the sign of the small residual movement is not the one intuition would predict.</w:t>
+      </w:r>
+    </w:p>
+    <w:p>
+      <w:pPr>
+        <w:jc w:val="both"/>
+        <w:rPr>
+          <w:lang w:val="en-US"/>
+        </w:rPr>
+      </w:pPr>
+      <w:r>
+        <w:rPr>
+          <w:lang w:val="en-US"/>
+        </w:rPr>
+        <w:t>The methodological consequence is direct. Component-wise ablation evaluated on end-task accuracy cannot distinguish a component that fails to do what it was designed to do from one that does exactly that and confers no benefit, and neither of these from a defect elsewhere in the same path. In the present architecture all three possibilities are simultaneously live, and the fused forecast separates none of them.</w:t>
+      </w:r>
+    </w:p>
+    <w:p>
+      <w:pPr>
+        <w:jc w:val="both"/>
+        <w:rPr>
+          <w:lang w:val="en-US"/>
+        </w:rPr>
+      </w:pPr>
+      <w:r>
+        <w:rPr>
+          <w:lang w:val="en-US"/>
+        </w:rPr>
+        <w:t>Compensation is not unbounded. On one household under the corrected objective the gate fails to absorb the state of the branch and the fused forecast falls below the constant baseline, with an error ratio of 1.36. This is the only such case in 17 households by two configurations, and it locates the boundary of the effect rather than contradicting it.</w:t>
+      </w:r>
+    </w:p>
+    <w:p>
+      <w:pPr>
+        <w:jc w:val="both"/>
+        <w:rPr>
+          <w:lang w:val="en-US"/>
+        </w:rPr>
+      </w:pPr>
+      <w:r>
+        <w:rPr>
+          <w:lang w:val="en-US"/>
+        </w:rPr>
+        <w:t xml:space="preserve">This household requires a caveat. It is also the household with the poorest data quality in the study, with degenerate test targets and week-long runs of constant readings in training (Section 4.2.1). We cannot </w:t>
+      </w:r>
+      <w:r>
+        <w:rPr>
+          <w:lang w:val="en-US"/>
+        </w:rPr>
         <w:lastRenderedPageBreak/>
-        <w:t>The same conclusion follows from the factorial experiment in the opposite direction (see Fig. S1). Across its eight cells the error of the decomposition branch varies by a factor of 5.3 to 14.4 depending on the household, while the fused forecast varies by between 1.5 and 11%; on the household with the largest test set the contrast is a factor of 6.9 in the path, from 162 to 1118 W, against 1.5% in the fused forecast. Degradation and repair are equally invisible, and the sign of the small residual movement is not the one intuition would predict.</w:t>
-      </w:r>
-    </w:p>
-    <w:p>
-      <w:pPr>
-        <w:jc w:val="both"/>
-        <w:rPr>
-          <w:lang w:val="en-US"/>
-        </w:rPr>
-      </w:pPr>
-      <w:r>
-        <w:rPr>
-          <w:lang w:val="en-US"/>
-        </w:rPr>
-        <w:t>The methodological consequence is direct. Component-wise ablation evaluated on end-task accuracy cannot distinguish a component that fails to do what it was designed to do from one that does exactly that and confers no benefit, and neither of these from a defect elsewhere in the same path. In the present architecture all three possibilities are simultaneously live, and the fused forecast separates none of them.</w:t>
-      </w:r>
-    </w:p>
-    <w:p>
-      <w:pPr>
-        <w:jc w:val="both"/>
-        <w:rPr>
-          <w:lang w:val="en-US"/>
-        </w:rPr>
-      </w:pPr>
-      <w:r>
-        <w:rPr>
-          <w:lang w:val="en-US"/>
-        </w:rPr>
-        <w:t>Compensation is not unbounded. On one household under the corrected objective the gate fails to absorb the state of the branch and the fused forecast falls below the constant baseline, with an error ratio of 1.36. This is the only such case in 17 households by two configurations, and it locates the boundary of the effect rather than contradicting it.</w:t>
-      </w:r>
-    </w:p>
-    <w:p>
-      <w:pPr>
-        <w:jc w:val="both"/>
-        <w:rPr>
-          <w:lang w:val="en-US"/>
-        </w:rPr>
-      </w:pPr>
-      <w:r>
-        <w:rPr>
-          <w:lang w:val="en-US"/>
-        </w:rPr>
-        <w:t>This household requires a caveat. It is also the household with the poorest data quality in the study, with degenerate test targets and week-long runs of constant readings in training (Section 4.2.1). We cannot separate the failure of compensation from the peculiarity of the data, and we do not claim to. The bound on compensation should be read as demonstrated in principle and not quantified.</w:t>
+        <w:t>separate the failure of compensation from the peculiarity of the data, and we do not claim to. The bound on compensation should be read as demonstrated in principle and not quantified.</w:t>
       </w:r>
     </w:p>
     <w:p>
@@ -5110,9 +5250,7 @@
         <w:rPr>
           <w:lang w:val="en-US"/>
         </w:rPr>
-        <w:t xml:space="preserve">Eight conditions were evaluated on every household and seed, and they differ in what they destroy. Under identity the model runs unaltered. Under cyclic, mode k receives the embedding of mode k+1, so the correspondence is broken while every embedding remains in use. Under random the rows of the embedding table are permuted, averaged over fifty non-identity permutations, with the per-window errors averaged rather than the predictions so that the averaging does not itself act as an ensemble; a variant averaging the predictions is reported alongside to show that it does not. Under mean every mode receives the average of </w:t>
-        <w:lastRenderedPageBreak/>
-        <w:t>the table, which removes the distinction between modes altogether. Under zeroed the embeddings are set to zero, which removes the vector as well as the distinction. Under shuffled the modes themselves are permuted independently in every test window. Under aggregation-permutation the aggregation weights alone are permuted, leaving embeddings intact.</w:t>
+        <w:t>Eight conditions were evaluated on every household and seed, and they differ in what they destroy. Under identity the model runs unaltered. Under cyclic, mode k receives the embedding of mode k+1, so the correspondence is broken while every embedding remains in use. Under random the rows of the embedding table are permuted, averaged over fifty non-identity permutations, with the per-window errors averaged rather than the predictions so that the averaging does not itself act as an ensemble; a variant averaging the predictions is reported alongside to show that it does not. Under mean every mode receives the average of the table, which removes the distinction between modes altogether. Under zeroed the embeddings are set to zero, which removes the vector as well as the distinction. Under shuffled the modes themselves are permuted independently in every test window. Under aggregation-permutation the aggregation weights alone are permuted, leaving embeddings intact.</w:t>
       </w:r>
     </w:p>
     <w:p>
@@ -5157,6 +5295,7 @@
           <w:rFonts w:ascii="Times New Roman" w:eastAsia="Times New Roman" w:hAnsi="Times New Roman"/>
           <w:lang w:val="en-US"/>
         </w:rPr>
+        <w:lastRenderedPageBreak/>
         <w:t>S5.6. The mechanism does what it was designed to do</w:t>
       </w:r>
     </w:p>
@@ -5261,38 +5400,44 @@
         <w:rPr>
           <w:lang w:val="en-US"/>
         </w:rPr>
+        <w:t>The comparison across conditions rules out the objection that the effect merely reflects a model pushed outside its training distribution. Random permutation preserves the norm and the distribution of the substituted vectors exactly, destroying only the correspondence between mode and embedding, and it produces 0.50% of household error against 0.67% for zeroing. Replacing every embedding by the table mean, which destroys the distinction between modes but halves the norm, produces less, 0.33%. The response therefore tracks the loss of correspondence rather than the change in norm, and the intervention measures what it was intended to measure. Averaging predictions instead of per-window errors changes the permutation result from 0.50 to 0.42%, confirming that the averaging does not act as an ensemble.</w:t>
+      </w:r>
+    </w:p>
+    <w:p>
+      <w:pPr>
+        <w:jc w:val="both"/>
+        <w:rPr>
+          <w:rFonts w:cs="Times New Roman"/>
+          <w:lang w:val="en-US"/>
+        </w:rPr>
+      </w:pPr>
+      <w:r>
+        <w:rPr>
+          <w:lang w:val="en-US"/>
+        </w:rPr>
+        <w:t>One ordering in Table S4 is worth noting. Permuting the embeddings hurts more than removing the distinction between them altogether: 0.50% against 0.33. Misinformation costs more than missing information, which is what one would expect of a mechanism the model relies on to route mode-specific processing, and is a mild positive result for the mechanism. It is also the largest such result we obtain.</w:t>
+      </w:r>
+    </w:p>
+    <w:p>
+      <w:pPr>
+        <w:jc w:val="both"/>
+        <w:rPr>
+          <w:rFonts w:cs="Times New Roman"/>
+          <w:lang w:val="en-US"/>
+        </w:rPr>
+      </w:pPr>
+      <w:r>
+        <w:rPr>
+          <w:lang w:val="en-US"/>
+        </w:rPr>
+        <w:t xml:space="preserve">The magnitude is another matter, and it is the same under every condition. No intervention has a median effect above 0.67% of household error, against the 2% threshold of practical significance stated in the protocol. Under zeroing, five of 17 households exceed that threshold and three of them are the households flagged in the data audit (Section 4.2.1); excluding those three, the largest effect among the remaining 14 falls from 12.3 to 2.3% and only two households remain marginally above it. Under the mean substitution </w:t>
+      </w:r>
+      <w:r>
+        <w:rPr>
+          <w:lang w:val="en-US"/>
+        </w:rPr>
         <w:lastRenderedPageBreak/>
-        <w:t>The comparison across conditions rules out the objection that the effect merely reflects a model pushed outside its training distribution. Random permutation preserves the norm and the distribution of the substituted vectors exactly, destroying only the correspondence between mode and embedding, and it produces 0.50% of household error against 0.67% for zeroing. Replacing every embedding by the table mean, which destroys the distinction between modes but halves the norm, produces less, 0.33%. The response therefore tracks the loss of correspondence rather than the change in norm, and the intervention measures what it was intended to measure. Averaging predictions instead of per-window errors changes the permutation result from 0.50 to 0.42%, confirming that the averaging does not act as an ensemble.</w:t>
-      </w:r>
-    </w:p>
-    <w:p>
-      <w:pPr>
-        <w:jc w:val="both"/>
-        <w:rPr>
-          <w:rFonts w:cs="Times New Roman"/>
-          <w:lang w:val="en-US"/>
-        </w:rPr>
-      </w:pPr>
-      <w:r>
-        <w:rPr>
-          <w:lang w:val="en-US"/>
-        </w:rPr>
-        <w:t>One ordering in Table S4 is worth noting. Permuting the embeddings hurts more than removing the distinction between them altogether: 0.50% against 0.33. Misinformation costs more than missing information, which is what one would expect of a mechanism the model relies on to route mode-specific processing, and is a mild positive result for the mechanism. It is also the largest such result we obtain.</w:t>
-      </w:r>
-    </w:p>
-    <w:p>
-      <w:pPr>
-        <w:jc w:val="both"/>
-        <w:rPr>
-          <w:rFonts w:cs="Times New Roman"/>
-          <w:lang w:val="en-US"/>
-        </w:rPr>
-      </w:pPr>
-      <w:r>
-        <w:rPr>
-          <w:lang w:val="en-US"/>
-        </w:rPr>
-        <w:t>The magnitude is another matter, and it is the same under every condition. No intervention has a median effect above 0.67% of household error, against the 2% threshold of practical significance stated in the protocol. Under zeroing, five of 17 households exceed that threshold and three of them are the households flagged in the data audit (Section 4.2.1); excluding those three, the largest effect among the remaining 14 falls from 12.3 to 2.3% and only two households remain marginally above it. Under the mean substitution three households exceed it. The mechanism can be disabled in seven distinct ways. None of the seven interventions has a median effect reaching the ±2% margin, although several household-specific effects exceed it, primarily among the data-quality cases.</w:t>
+        <w:t>three households exceed it. The mechanism can be disabled in seven distinct ways. None of the seven interventions has a median effect reaching the ±2% margin, although several household-specific effects exceed it, primarily among the data-quality cases.</w:t>
       </w:r>
     </w:p>
     <w:p>
@@ -6180,9 +6325,7 @@
         <w:rPr>
           <w:lang w:val="en-US"/>
         </w:rPr>
-        <w:t xml:space="preserve">Probe accuracy is significantly lower in the configuration where the mechanism matters more. Its median is 0.946 under the corrected objective against 0.981 under the original one, and the difference is consistent across households (Wilcoxon p = 0.0004, n = 17). Where the decomposition branch is compressed to a </w:t>
-        <w:lastRenderedPageBreak/>
-        <w:t>near-constant, mode identity is encoded almost perfectly and is worth nothing; where the path actually forecasts, identity is encoded less sharply and is worth slightly more.</w:t>
+        <w:t>Probe accuracy is significantly lower in the configuration where the mechanism matters more. Its median is 0.946 under the corrected objective against 0.981 under the original one, and the difference is consistent across households (Wilcoxon p = 0.0004, n = 17). Where the decomposition branch is compressed to a near-constant, mode identity is encoded almost perfectly and is worth nothing; where the path actually forecasts, identity is encoded less sharply and is worth slightly more.</w:t>
       </w:r>
     </w:p>
     <w:p>
@@ -6244,7 +6387,14 @@
         <w:rPr>
           <w:lang w:val="en-US"/>
         </w:rPr>
-        <w:t>The hypothesis under test was formulated on five households of a single dataset (see Fig. S3 for required sample sizes under proper variance propagation), where the comparison favored the configuration containing the identity mechanism at p = 0.032. That study was never published, and the figures quoted here are taken from its final report; its preprocessing code was not the code used here and its trained artifacts were built on a different chronological split, so the comparison available to us is with its design and its reported statistic rather than with its intermediate outputs. Nothing in the present analysis suggests that this figure was computed incorrectly. It is, rather, what a study of that size will produce with some regularity when the effect is null and the uncertainty is understated.</w:t>
+        <w:t xml:space="preserve">The hypothesis under test was formulated on five households of a single dataset (see Fig. S3 for required sample sizes under proper variance propagation), where the comparison favored the configuration containing the identity mechanism at p = 0.032. That study was never published, and the figures quoted </w:t>
+      </w:r>
+      <w:r>
+        <w:rPr>
+          <w:lang w:val="en-US"/>
+        </w:rPr>
+        <w:lastRenderedPageBreak/>
+        <w:t>here are taken from its final report; its preprocessing code was not the code used here and its trained artifacts were built on a different chronological split, so the comparison available to us is with its design and its reported statistic rather than with its intermediate outputs. Nothing in the present analysis suggests that this figure was computed incorrectly. It is, rather, what a study of that size will produce with some regularity when the effect is null and the uncertainty is understated.</w:t>
       </w:r>
     </w:p>
     <w:p>
@@ -6339,9 +6489,7 @@
         <w:rPr>
           <w:lang w:val="en-US"/>
         </w:rPr>
-        <w:t xml:space="preserve">Two mechanisms compound. First, the standard error used at the time was estimated by resampling test observations alone and therefore captured about a fifth of the variance, as quantified in the preceding section. Second, five households provide no useful power against an effect of this size: with full variance propagation, detecting a mean effect of one% of household error at 80% power requires 41 households on </w:t>
-        <w:lastRenderedPageBreak/>
-        <w:t>the untrimmed estimate and 11 on the trimmed one. A study with five is not underpowered by a modest margin, and its significant results are dominated by whichever direction the sampling happened to take.</w:t>
+        <w:t>Two mechanisms compound. First, the standard error used at the time was estimated by resampling test observations alone and therefore captured about a fifth of the variance, as quantified in the preceding section. Second, five households provide no useful power against an effect of this size: with full variance propagation, detecting a mean effect of one% of household error at 80% power requires 41 households on the untrimmed estimate and 11 on the trimmed one. A study with five is not underpowered by a modest margin, and its significant results are dominated by whichever direction the sampling happened to take.</w:t>
       </w:r>
     </w:p>
     <w:p>
@@ -6399,6 +6547,7 @@
         <w:rPr>
           <w:lang w:val="en-US"/>
         </w:rPr>
+        <w:lastRenderedPageBreak/>
         <w:t>Individually, 2 of the 17 households show an effect distinguishable from zero after full variance propagation, against 7 under window-only standard errors. Neither of the two exceeds the practical threshold once expressed relative to its own error.</w:t>
       </w:r>
     </w:p>
@@ -6490,7 +6639,6 @@
           <w:rFonts w:ascii="Times New Roman" w:eastAsia="Times New Roman" w:hAnsi="Times New Roman"/>
           <w:lang w:val="en-US"/>
         </w:rPr>
-        <w:lastRenderedPageBreak/>
         <w:t>S6.3. What replicated</w:t>
       </w:r>
     </w:p>
@@ -6956,6 +7104,7 @@
                 <w:szCs w:val="20"/>
                 <w:lang w:val="en-US"/>
               </w:rPr>
+              <w:lastRenderedPageBreak/>
               <w:t>Units truncated at zero</w:t>
             </w:r>
           </w:p>
@@ -7348,7 +7497,7 @@
                 <w:szCs w:val="20"/>
                 <w:lang w:val="en-US"/>
               </w:rPr>
-              <w:t xml:space="preserve">I²; Q(16); p</w:t>
+              <w:t>I²; Q(16); p</w:t>
             </w:r>
           </w:p>
         </w:tc>
@@ -7709,38 +7858,44 @@
           <w:rFonts w:ascii="Times New Roman" w:eastAsia="Times New Roman" w:hAnsi="Times New Roman"/>
           <w:lang w:val="en-US"/>
         </w:rPr>
+        <w:t>S6.5. Sensitivity to the evaluation design</w:t>
+      </w:r>
+    </w:p>
+    <w:p>
+      <w:pPr>
+        <w:jc w:val="both"/>
+        <w:rPr>
+          <w:rFonts w:cs="Times New Roman"/>
+          <w:lang w:val="en-US"/>
+        </w:rPr>
+      </w:pPr>
+      <w:r>
+        <w:rPr>
+          <w:lang w:val="en-US"/>
+        </w:rPr>
+        <w:t>The truncation of the test segment to 120 windows was a design choice, and the registration document required that it be checked. Because truncation affects only the test slice, the training and validation segments being identical under both settings, the check was performed on the same trained weights and differs from the primary analysis in nothing but the evaluation set. Both criteria hold under both settings: the median share is 83 and 81% against a threshold of one half, the seed-to-evaluation variance ratio 4.9 and 4.1 against a threshold of one, the sign split is unchanged, and the summary effect is indistinguishable from zero in both.</w:t>
+      </w:r>
+    </w:p>
+    <w:p>
+      <w:pPr>
+        <w:jc w:val="both"/>
+        <w:rPr>
+          <w:rFonts w:cs="Times New Roman"/>
+          <w:lang w:val="en-US"/>
+        </w:rPr>
+      </w:pPr>
+      <w:r>
+        <w:rPr>
+          <w:lang w:val="en-US"/>
+        </w:rPr>
+        <w:t>The prediction we registered for this check was nonetheless wrong, and the reason is instructive. We expected the share to rise with the number of windows, since the window component of the variance of the mean is divided by it; instead it fell slightly. Enlarging the test set changes not only the divisor but the composition of the test set, and the additional 37 windows fall in a later and harder segment of the series: the mean within-client variance rose by a factor of 1.51 where a fall by a factor of 1.31 was expected, and the two effects canceled. The stability of the share across evaluation designs is thus produced by compensation between two opposing mechanisms, not by independence from the design. The seed-to-</w:t>
+      </w:r>
+      <w:r>
+        <w:rPr>
+          <w:lang w:val="en-US"/>
+        </w:rPr>
         <w:lastRenderedPageBreak/>
-        <w:t>S6.5. Sensitivity to the evaluation design</w:t>
-      </w:r>
-    </w:p>
-    <w:p>
-      <w:pPr>
-        <w:jc w:val="both"/>
-        <w:rPr>
-          <w:rFonts w:cs="Times New Roman"/>
-          <w:lang w:val="en-US"/>
-        </w:rPr>
-      </w:pPr>
-      <w:r>
-        <w:rPr>
-          <w:lang w:val="en-US"/>
-        </w:rPr>
-        <w:t>The truncation of the test segment to 120 windows was a design choice, and the registration document required that it be checked. Because truncation affects only the test slice, the training and validation segments being identical under both settings, the check was performed on the same trained weights and differs from the primary analysis in nothing but the evaluation set. Both criteria hold under both settings: the median share is 83 and 81% against a threshold of one half, the seed-to-evaluation variance ratio 4.9 and 4.1 against a threshold of one, the sign split is unchanged, and the summary effect is indistinguishable from zero in both.</w:t>
-      </w:r>
-    </w:p>
-    <w:p>
-      <w:pPr>
-        <w:jc w:val="both"/>
-        <w:rPr>
-          <w:rFonts w:cs="Times New Roman"/>
-          <w:lang w:val="en-US"/>
-        </w:rPr>
-      </w:pPr>
-      <w:r>
-        <w:rPr>
-          <w:lang w:val="en-US"/>
-        </w:rPr>
-        <w:t>The prediction we registered for this check was nonetheless wrong, and the reason is instructive. We expected the share to rise with the number of windows, since the window component of the variance of the mean is divided by it; instead it fell slightly. Enlarging the test set changes not only the divisor but the composition of the test set, and the additional 37 windows fall in a later and harder segment of the series: the mean within-client variance rose by a factor of 1.51 where a fall by a factor of 1.31 was expected, and the two effects canceled. The stability of the share across evaluation designs is thus produced by compensation between two opposing mechanisms, not by independence from the design. The seed-to-evaluation variance ratio would be invariant under pure 1/W scaling with unchanged evaluation composition; its observed 16% change reflects the harder additional evaluation segment.</w:t>
+        <w:t>evaluation variance ratio would be invariant under pure 1/W scaling with unchanged evaluation composition; its observed 16% change reflects the harder additional evaluation segment.</w:t>
       </w:r>
     </w:p>
     <w:p>
@@ -8215,7 +8370,7 @@
                 <w:szCs w:val="20"/>
                 <w:lang w:val="en-US"/>
               </w:rPr>
-              <w:t xml:space="preserve">summary effect ≈0, p = 0.752; I2 = 18.4 %, Q(16) = 19.6, p = 0.238</w:t>
+              <w:t>summary effect ≈0, p = 0.752; I2 = 18.4 %, Q(16) = 19.6, p = 0.238</w:t>
             </w:r>
           </w:p>
         </w:tc>
@@ -8314,7 +8469,6 @@
         <w:rPr>
           <w:lang w:val="en-US"/>
         </w:rPr>
-        <w:lastRenderedPageBreak/>
         <w:t>The official OpenML folds were smaller than the 20% hold-outs anticipated during selection. Restricting to n_test≥150 leaves 15 tasks and yields pooled effects of 0.629 percentage points for balanced error (95% CI [−0.166, 1.424]) and 0.0205 for cross-entropy (95% CI [−0.0024, 0.0434]). At n_test≥250, 11 tasks remain and the corresponding estimates are 0.614 [−0.185, 1.412] and 0.0175 [−0.0042, 0.0392]. Direction is stable, but the cross-entropy significance is not. The benchmark therefore supports a heterogeneous, metric-dependent identity benefit rather than a general performance law.</w:t>
       </w:r>
     </w:p>
@@ -8361,7 +8515,14 @@
         <w:rPr>
           <w:lang w:val="en-US"/>
         </w:rPr>
-        <w:t xml:space="preserve">Table S8. OpenML-CC18 tasks retained in the scope probe. Sizes are those of the official repeat-0, fold-0, sample-0 split; n is the full dataset size and the test fold is the official tenth. Feature counts exclude the target and are those of the OpenML version cited by the data ID. The flip rate is the percentage of test examples whose predicted label changes when the tokenizer identity term is removed, averaged over the five paired seeds; it is the diagnostic discussed in Section S7.1. The machine-readable counterparts are results/cc18_per_dataset_summary.csv and results/cc18_flip_diagnostic.csv in the reproducibility archive.</w:t>
+        <w:t xml:space="preserve">Table S8. OpenML-CC18 tasks retained in the scope probe. Sizes are those of the official repeat-0, fold-0, sample-0 split; n is the full dataset size and the test fold is the official tenth. Feature counts exclude the target and are those of the OpenML version cited by the data ID. The flip rate is the percentage of test examples whose predicted label changes when the tokenizer identity term is removed, averaged over the </w:t>
+      </w:r>
+      <w:r>
+        <w:rPr>
+          <w:lang w:val="en-US"/>
+        </w:rPr>
+        <w:lastRenderedPageBreak/>
+        <w:t>five paired seeds; it is the diagnostic discussed in Section S7.1. The machine-readable counterparts are results/cc18_per_dataset_summary.csv and results/cc18_flip_diagnostic.csv in the reproducibility archive.</w:t>
       </w:r>
     </w:p>
     <w:tbl>
@@ -11916,7 +12077,7 @@
         <w:rPr>
           <w:lang w:val="en-US"/>
         </w:rPr>
-        <w:t xml:space="preserve">One limitation of this design should be read together with the results. Every task is evaluated on a single official OpenML split, so the uncertainty attributable to alternative train/test partitions is not estimated anywhere in Section S7. The components reported are the training-seed component and the finite-test-sample component at that fixed split; a study wishing to bound split-induced variation would need to repeat the analysis across the ten official folds, which we did not do. This also bounds the interpretation of the small official test folds discussed in Section S7.1: their effect on precision is visible, but their effect on the point estimate cannot be separated from the particular partition.</w:t>
+        <w:t>One limitation of this design should be read together with the results. Every task is evaluated on a single official OpenML split, so the uncertainty attributable to alternative train/test partitions is not estimated anywhere in Section S7. The components reported are the training-seed component and the finite-test-sample component at that fixed split; a study wishing to bound split-induced variation would need to repeat the analysis across the ten official folds, which we did not do. This also bounds the interpretation of the small official test folds discussed in Section S7.1: their effect on precision is visible, but their effect on the point estimate cannot be separated from the particular partition.</w:t>
       </w:r>
     </w:p>
     <w:p>
@@ -11931,9 +12092,7 @@
         <w:rPr>
           <w:lang w:val="en-US"/>
         </w:rPr>
-        <w:t xml:space="preserve">A second limitation concerns what the intervention removes. Deleting the per-feature bias of the tokenizer removes the identity cue, one free parameter per feature and a feature-specific calibration offset in a single operation, so an increase in balanced error is consistent with any of the three. A parameter-matched control </w:t>
-        <w:lastRenderedPageBreak/>
-        <w:t xml:space="preserve">that holds capacity fixed while destroying identity — a bias shared across features, or a bias permuted across features — would separate them and is the natural next experiment. Section 6.2.6 of the article states the same limitation.</w:t>
+        <w:t>A second limitation concerns what the intervention removes. Deleting the per-feature bias of the tokenizer removes the identity cue, one free parameter per feature and a feature-specific calibration offset in a single operation, so an increase in balanced error is consistent with any of the three. A parameter-matched control that holds capacity fixed while destroying identity — a bias shared across features, or a bias permuted across features — would separate them and is the natural next experiment. Section 6.2.6 of the article states the same limitation.</w:t>
       </w:r>
     </w:p>
     <w:p>
@@ -12692,37 +12851,43 @@
         <w:rPr>
           <w:lang w:val="en-US"/>
         </w:rPr>
+        <w:t>The intervention route of R3 is the honest answer to the cost question. Its estimates were an order of magnitude more stable than the retraining comparison at the same number of seeds, and it requires no training at all beyond the models one has already fitted. Where the scientific question can be posed as a within-model contrast, and for a component that acts at inference it usually can, an investigator obtains a better-determined answer for the cost of a forward pass. The expensive protocol is what we needed to establish that this is so; it is not what we recommend as routine.</w:t>
+      </w:r>
+    </w:p>
+    <w:p>
+      <w:pPr>
+        <w:pStyle w:val="2"/>
+        <w:rPr>
+          <w:lang w:val="en-US"/>
+        </w:rPr>
+      </w:pPr>
+      <w:r>
+        <w:rPr>
+          <w:rFonts w:ascii="Times New Roman" w:eastAsia="Times New Roman" w:hAnsi="Times New Roman"/>
+          <w:lang w:val="en-US"/>
+        </w:rPr>
+        <w:t>S8.3. Study-specific decision margin</w:t>
+      </w:r>
+    </w:p>
+    <w:p>
+      <w:pPr>
+        <w:jc w:val="both"/>
+        <w:rPr>
+          <w:lang w:val="en-US"/>
+        </w:rPr>
+      </w:pPr>
+      <w:r>
+        <w:rPr>
+          <w:lang w:val="en-US"/>
+        </w:rPr>
+        <w:t xml:space="preserve">The ±2% household margin is a study-specific decision aid, not a universal economic threshold. System-level generation-cost estimates do not transfer directly to a household, and household value depends on storage, tariff structure and the operational decision. The margin was selected within a range whose </w:t>
+      </w:r>
+      <w:r>
+        <w:rPr>
+          <w:lang w:val="en-US"/>
+        </w:rPr>
         <w:lastRenderedPageBreak/>
-        <w:t>The intervention route of R3 is the honest answer to the cost question. Its estimates were an order of magnitude more stable than the retraining comparison at the same number of seeds, and it requires no training at all beyond the models one has already fitted. Where the scientific question can be posed as a within-model contrast, and for a component that acts at inference it usually can, an investigator obtains a better-determined answer for the cost of a forward pass. The expensive protocol is what we needed to establish that this is so; it is not what we recommend as routine.</w:t>
-      </w:r>
-    </w:p>
-    <w:p>
-      <w:pPr>
-        <w:pStyle w:val="2"/>
-        <w:rPr>
-          <w:lang w:val="en-US"/>
-        </w:rPr>
-      </w:pPr>
-      <w:r>
-        <w:rPr>
-          <w:rFonts w:ascii="Times New Roman" w:eastAsia="Times New Roman" w:hAnsi="Times New Roman"/>
-          <w:lang w:val="en-US"/>
-        </w:rPr>
-        <w:t>S8.3. Study-specific decision margin</w:t>
-      </w:r>
-    </w:p>
-    <w:p>
-      <w:pPr>
-        <w:jc w:val="both"/>
-        <w:rPr>
-          <w:lang w:val="en-US"/>
-        </w:rPr>
-      </w:pPr>
-      <w:r>
-        <w:rPr>
-          <w:lang w:val="en-US"/>
-        </w:rPr>
-        <w:t>The ±2% household margin is a study-specific decision aid, not a universal economic threshold. System-level generation-cost estimates do not transfer directly to a household, and household value depends on storage, tariff structure and the operational decision. The margin was selected within a range whose interpretation is empirically stable here: 7/17, 4/17 and 0/17 households exceed 1%, 2% and 5%, respectively. No corresponding margin is imposed on OpenML-CC18.</w:t>
+        <w:t>interpretation is empirically stable here: 7/17, 4/17 and 0/17 households exceed 1%, 2% and 5%, respectively. No corresponding margin is imposed on OpenML-CC18.</w:t>
       </w:r>
     </w:p>
     <w:p>
@@ -12906,7 +13071,6 @@
         <w:rPr>
           <w:lang w:val="en-US"/>
         </w:rPr>
-        <w:lastRenderedPageBreak/>
         <w:t>One further limitation bears on the compensation bound. The single case in which the gate fails to absorb a branch failure is also the household with degenerate test data, so the boundary of compensation is demonstrated but not located.</w:t>
       </w:r>
     </w:p>
@@ -12938,7 +13102,14 @@
         <w:rPr>
           <w:lang w:val="en-US"/>
         </w:rPr>
-        <w:t>This study contains analyses with different inferential status. The household variance decomposition and branch diagnostics are exploratory. The ECL study is confirmatory: eligibility, sampled units, estimand, analysis and success criteria were registered before training. The OpenML-CC18 extension was added to assess generalization beyond energy; within that extension, the task selection, seeds, metrics and success criterion were registered before final outcomes, whereas the prediction-flip and minimum-test-size analyses are post-hoc sensitivities. The registration and complete deviation logs do not guarantee correctness, but they make the analytical sequence auditable.</w:t>
+        <w:t xml:space="preserve">This study contains analyses with different inferential status. The household variance decomposition and branch diagnostics are exploratory. The ECL study is confirmatory: eligibility, sampled units, estimand, analysis and success criteria were registered before training. The OpenML-CC18 extension was added to assess generalization beyond energy; within that extension, the task selection, seeds, metrics and success criterion were registered before final outcomes, whereas the prediction-flip and minimum-test-size analyses </w:t>
+      </w:r>
+      <w:r>
+        <w:rPr>
+          <w:lang w:val="en-US"/>
+        </w:rPr>
+        <w:lastRenderedPageBreak/>
+        <w:t>are post-hoc sensitivities. The registration and complete deviation logs do not guarantee correctness, but they make the analytical sequence auditable.</w:t>
       </w:r>
     </w:p>
     <w:p>
@@ -13202,9 +13373,7 @@
         <w:rPr>
           <w:lang w:val="en-US"/>
         </w:rPr>
-        <w:t xml:space="preserve">Gundersen, O. E., Shamsaliei, S., Kjærnli, H. S., &amp; Langseth, H. (2023). On reporting robust and trustworthy conclusions from model comparison studies involving neural networks and randomness. In Proceedings of the 2023 </w:t>
-        <w:lastRenderedPageBreak/>
-        <w:t xml:space="preserve">ACM Conference on Reproducibility and Replicability (pp. 37–61). ACM. https://doi.org/10.1145/3589806.3600044 </w:t>
+        <w:t xml:space="preserve">Gundersen, O. E., Shamsaliei, S., Kjærnli, H. S., &amp; Langseth, H. (2023). On reporting robust and trustworthy conclusions from model comparison studies involving neural networks and randomness. In Proceedings of the 2023 ACM Conference on Reproducibility and Replicability (pp. 37–61). ACM. https://doi.org/10.1145/3589806.3600044 </w:t>
       </w:r>
     </w:p>
     <w:p>
@@ -13272,6 +13441,7 @@
         <w:rPr>
           <w:lang w:val="en-US"/>
         </w:rPr>
+        <w:lastRenderedPageBreak/>
         <w:t>Kelly, J., &amp; Knottenbelt, W. (2015). The UK-DALE dataset, domestic appliance-level electricity demand and whole-house demand from five UK homes. Scientific Data, 2(1), 150007. https://doi.org/10.1038/sdata.2015.7</w:t>
       </w:r>
     </w:p>
@@ -13558,7 +13728,6 @@
         <w:rPr>
           <w:lang w:val="en-US"/>
         </w:rPr>
-        <w:lastRenderedPageBreak/>
         <w:t>Xue, W., Zhou, T., Wen, Q., Gao, J., Ding, B., &amp; Jin, R. (2024). CARD: Channel aligned robust blend transformer for time series forecasting. In The Twelfth International Conference on Learning Representations.</w:t>
       </w:r>
     </w:p>
@@ -13643,6 +13812,7 @@
         <w:rPr>
           <w:lang w:val="en-US"/>
         </w:rPr>
+        <w:lastRenderedPageBreak/>
         <w:t>Zhou, T., Ma, Z., Wang, X., Wen, Q., Sun, L., Yao, T., Yin, W., &amp; Jin, R. (2022b). FiLM: Frequency improved Legendre memory model for long-term time series forecasting. In Advances in Neural Information Processing Systems 35 (NeurIPS 2022).</w:t>
       </w:r>
     </w:p>

</xml_diff>